<commit_message>
docs: Canary and Blue/Green rollouts
</commit_message>
<xml_diff>
--- a/docs/Argo Rollouts_Canary and Blue_Green rollouts.docx
+++ b/docs/Argo Rollouts_Canary and Blue_Green rollouts.docx
@@ -20,6 +20,9 @@
     </w:p>
     <w:p>
       <w:r>
+        <w:rPr>
+          <w:noProof/>
+        </w:rPr>
         <w:drawing>
           <wp:inline distT="0" distB="0" distL="0" distR="0" wp14:anchorId="7F15B654" wp14:editId="72A8215C">
             <wp:extent cx="5943600" cy="5943600"/>
@@ -59,6 +62,9 @@
     </w:p>
     <w:p>
       <w:r>
+        <w:rPr>
+          <w:noProof/>
+        </w:rPr>
         <w:lastRenderedPageBreak/>
         <w:drawing>
           <wp:inline distT="0" distB="0" distL="0" distR="0" wp14:anchorId="57B91B9B" wp14:editId="6EC9F3C5">
@@ -102,13 +108,7 @@
         <w:rPr>
           <w:highlight w:val="yellow"/>
         </w:rPr>
-        <w:t xml:space="preserve">Canary rollout with </w:t>
-      </w:r>
-      <w:r>
-        <w:rPr>
-          <w:highlight w:val="yellow"/>
-        </w:rPr>
-        <w:t>ALB Traffic Routing</w:t>
+        <w:t>Canary rollout with ALB Traffic Routing</w:t>
       </w:r>
     </w:p>
     <w:p>
@@ -116,23 +116,7 @@
         <w:t>I</w:t>
       </w:r>
       <w:r>
-        <w:t xml:space="preserve"> integrated Argo Rollouts with the AWS Load Balancer </w:t>
-      </w:r>
-      <w:proofErr w:type="gramStart"/>
-      <w:r>
-        <w:t>Controller</w:t>
-      </w:r>
-      <w:proofErr w:type="gramEnd"/>
-      <w:r>
-        <w:t xml:space="preserve"> so the ALB managed weighted traffic between stable and canary target groups, allowing progressive delivery without relying on </w:t>
-      </w:r>
-      <w:proofErr w:type="gramStart"/>
-      <w:r>
-        <w:t>replica ratios</w:t>
-      </w:r>
-      <w:proofErr w:type="gramEnd"/>
-      <w:r>
-        <w:t>.</w:t>
+        <w:t xml:space="preserve"> integrated Argo Rollouts with the AWS Load Balancer Controller so the ALB managed weighted traffic between stable and canary target groups, allowing progressive delivery without relying on replica ratios.</w:t>
       </w:r>
     </w:p>
     <w:p>
@@ -249,13 +233,8 @@
       </w:r>
     </w:p>
     <w:p>
-      <w:proofErr w:type="spellStart"/>
-      <w:r>
-        <w:t>GitOps</w:t>
-      </w:r>
-      <w:proofErr w:type="spellEnd"/>
-      <w:r>
-        <w:t xml:space="preserve"> Repository</w:t>
+      <w:r>
+        <w:t>GitOps Repository</w:t>
       </w:r>
     </w:p>
     <w:p>
@@ -380,6 +359,9 @@
     </w:p>
     <w:p>
       <w:r>
+        <w:rPr>
+          <w:noProof/>
+        </w:rPr>
         <w:lastRenderedPageBreak/>
         <w:drawing>
           <wp:inline distT="0" distB="0" distL="0" distR="0" wp14:anchorId="2E7BDA88" wp14:editId="1D0924F2">
@@ -420,6 +402,9 @@
     </w:p>
     <w:p>
       <w:r>
+        <w:rPr>
+          <w:noProof/>
+        </w:rPr>
         <w:lastRenderedPageBreak/>
         <w:drawing>
           <wp:inline distT="0" distB="0" distL="0" distR="0" wp14:anchorId="7F043432" wp14:editId="53EAF53A">
@@ -460,6 +445,9 @@
     </w:p>
     <w:p>
       <w:r>
+        <w:rPr>
+          <w:noProof/>
+        </w:rPr>
         <w:lastRenderedPageBreak/>
         <w:drawing>
           <wp:inline distT="0" distB="0" distL="0" distR="0" wp14:anchorId="5ED650C8" wp14:editId="1A6825C0">
@@ -500,6 +488,9 @@
     </w:p>
     <w:p>
       <w:r>
+        <w:rPr>
+          <w:noProof/>
+        </w:rPr>
         <w:lastRenderedPageBreak/>
         <w:drawing>
           <wp:inline distT="0" distB="0" distL="0" distR="0" wp14:anchorId="66DD256A" wp14:editId="7EC8CF95">
@@ -540,11 +531,13 @@
     </w:p>
     <w:p>
       <w:r>
-        <w:lastRenderedPageBreak/>
+        <w:rPr>
+          <w:noProof/>
+        </w:rPr>
         <w:drawing>
-          <wp:inline distT="0" distB="0" distL="0" distR="0" wp14:anchorId="2B32E434" wp14:editId="1504538D">
-            <wp:extent cx="5943600" cy="3429635"/>
-            <wp:effectExtent l="0" t="0" r="0" b="0"/>
+          <wp:inline distT="0" distB="0" distL="0" distR="0" wp14:anchorId="2B32E434" wp14:editId="41A853A7">
+            <wp:extent cx="5365814" cy="3096235"/>
+            <wp:effectExtent l="0" t="0" r="6350" b="9525"/>
             <wp:docPr id="656592701" name="Picture 1"/>
             <wp:cNvGraphicFramePr>
               <a:graphicFrameLocks xmlns:a="http://schemas.openxmlformats.org/drawingml/2006/main" noChangeAspect="1"/>
@@ -565,7 +558,286 @@
                   <pic:spPr>
                     <a:xfrm>
                       <a:off x="0" y="0"/>
-                      <a:ext cx="5943600" cy="3429635"/>
+                      <a:ext cx="5369069" cy="3098113"/>
+                    </a:xfrm>
+                    <a:prstGeom prst="rect">
+                      <a:avLst/>
+                    </a:prstGeom>
+                  </pic:spPr>
+                </pic:pic>
+              </a:graphicData>
+            </a:graphic>
+          </wp:inline>
+        </w:drawing>
+      </w:r>
+    </w:p>
+    <w:p/>
+    <w:p>
+      <w:r>
+        <w:t>Blue/Green rollout:</w:t>
+      </w:r>
+    </w:p>
+    <w:p>
+      <w:r>
+        <w:drawing>
+          <wp:inline distT="0" distB="0" distL="0" distR="0" wp14:anchorId="6A1A0663" wp14:editId="79FC9820">
+            <wp:extent cx="5943600" cy="4790440"/>
+            <wp:effectExtent l="0" t="0" r="0" b="0"/>
+            <wp:docPr id="601362990" name="Picture 1"/>
+            <wp:cNvGraphicFramePr>
+              <a:graphicFrameLocks xmlns:a="http://schemas.openxmlformats.org/drawingml/2006/main" noChangeAspect="1"/>
+            </wp:cNvGraphicFramePr>
+            <a:graphic xmlns:a="http://schemas.openxmlformats.org/drawingml/2006/main">
+              <a:graphicData uri="http://schemas.openxmlformats.org/drawingml/2006/picture">
+                <pic:pic xmlns:pic="http://schemas.openxmlformats.org/drawingml/2006/picture">
+                  <pic:nvPicPr>
+                    <pic:cNvPr id="601362990" name=""/>
+                    <pic:cNvPicPr/>
+                  </pic:nvPicPr>
+                  <pic:blipFill>
+                    <a:blip r:embed="rId11"/>
+                    <a:stretch>
+                      <a:fillRect/>
+                    </a:stretch>
+                  </pic:blipFill>
+                  <pic:spPr>
+                    <a:xfrm>
+                      <a:off x="0" y="0"/>
+                      <a:ext cx="5943600" cy="4790440"/>
+                    </a:xfrm>
+                    <a:prstGeom prst="rect">
+                      <a:avLst/>
+                    </a:prstGeom>
+                  </pic:spPr>
+                </pic:pic>
+              </a:graphicData>
+            </a:graphic>
+          </wp:inline>
+        </w:drawing>
+      </w:r>
+    </w:p>
+    <w:p>
+      <w:r>
+        <w:lastRenderedPageBreak/>
+        <w:drawing>
+          <wp:inline distT="0" distB="0" distL="0" distR="0" wp14:anchorId="63CEA43D" wp14:editId="63D9A9DA">
+            <wp:extent cx="5943600" cy="4674870"/>
+            <wp:effectExtent l="0" t="0" r="0" b="0"/>
+            <wp:docPr id="1677977686" name="Picture 1"/>
+            <wp:cNvGraphicFramePr>
+              <a:graphicFrameLocks xmlns:a="http://schemas.openxmlformats.org/drawingml/2006/main" noChangeAspect="1"/>
+            </wp:cNvGraphicFramePr>
+            <a:graphic xmlns:a="http://schemas.openxmlformats.org/drawingml/2006/main">
+              <a:graphicData uri="http://schemas.openxmlformats.org/drawingml/2006/picture">
+                <pic:pic xmlns:pic="http://schemas.openxmlformats.org/drawingml/2006/picture">
+                  <pic:nvPicPr>
+                    <pic:cNvPr id="1677977686" name=""/>
+                    <pic:cNvPicPr/>
+                  </pic:nvPicPr>
+                  <pic:blipFill>
+                    <a:blip r:embed="rId12"/>
+                    <a:stretch>
+                      <a:fillRect/>
+                    </a:stretch>
+                  </pic:blipFill>
+                  <pic:spPr>
+                    <a:xfrm>
+                      <a:off x="0" y="0"/>
+                      <a:ext cx="5943600" cy="4674870"/>
+                    </a:xfrm>
+                    <a:prstGeom prst="rect">
+                      <a:avLst/>
+                    </a:prstGeom>
+                  </pic:spPr>
+                </pic:pic>
+              </a:graphicData>
+            </a:graphic>
+          </wp:inline>
+        </w:drawing>
+      </w:r>
+      <w:r>
+        <w:drawing>
+          <wp:inline distT="0" distB="0" distL="0" distR="0" wp14:anchorId="5348271D" wp14:editId="4B09A149">
+            <wp:extent cx="5943600" cy="2870200"/>
+            <wp:effectExtent l="0" t="0" r="0" b="6350"/>
+            <wp:docPr id="104976618" name="Picture 1"/>
+            <wp:cNvGraphicFramePr>
+              <a:graphicFrameLocks xmlns:a="http://schemas.openxmlformats.org/drawingml/2006/main" noChangeAspect="1"/>
+            </wp:cNvGraphicFramePr>
+            <a:graphic xmlns:a="http://schemas.openxmlformats.org/drawingml/2006/main">
+              <a:graphicData uri="http://schemas.openxmlformats.org/drawingml/2006/picture">
+                <pic:pic xmlns:pic="http://schemas.openxmlformats.org/drawingml/2006/picture">
+                  <pic:nvPicPr>
+                    <pic:cNvPr id="104976618" name=""/>
+                    <pic:cNvPicPr/>
+                  </pic:nvPicPr>
+                  <pic:blipFill>
+                    <a:blip r:embed="rId13"/>
+                    <a:stretch>
+                      <a:fillRect/>
+                    </a:stretch>
+                  </pic:blipFill>
+                  <pic:spPr>
+                    <a:xfrm>
+                      <a:off x="0" y="0"/>
+                      <a:ext cx="5943600" cy="2870200"/>
+                    </a:xfrm>
+                    <a:prstGeom prst="rect">
+                      <a:avLst/>
+                    </a:prstGeom>
+                  </pic:spPr>
+                </pic:pic>
+              </a:graphicData>
+            </a:graphic>
+          </wp:inline>
+        </w:drawing>
+      </w:r>
+    </w:p>
+    <w:p/>
+    <w:p>
+      <w:r>
+        <w:lastRenderedPageBreak/>
+        <w:drawing>
+          <wp:inline distT="0" distB="0" distL="0" distR="0" wp14:anchorId="6484352B" wp14:editId="38A2ECAA">
+            <wp:extent cx="5943600" cy="2837815"/>
+            <wp:effectExtent l="0" t="0" r="0" b="635"/>
+            <wp:docPr id="421455715" name="Picture 1"/>
+            <wp:cNvGraphicFramePr>
+              <a:graphicFrameLocks xmlns:a="http://schemas.openxmlformats.org/drawingml/2006/main" noChangeAspect="1"/>
+            </wp:cNvGraphicFramePr>
+            <a:graphic xmlns:a="http://schemas.openxmlformats.org/drawingml/2006/main">
+              <a:graphicData uri="http://schemas.openxmlformats.org/drawingml/2006/picture">
+                <pic:pic xmlns:pic="http://schemas.openxmlformats.org/drawingml/2006/picture">
+                  <pic:nvPicPr>
+                    <pic:cNvPr id="421455715" name=""/>
+                    <pic:cNvPicPr/>
+                  </pic:nvPicPr>
+                  <pic:blipFill>
+                    <a:blip r:embed="rId14"/>
+                    <a:stretch>
+                      <a:fillRect/>
+                    </a:stretch>
+                  </pic:blipFill>
+                  <pic:spPr>
+                    <a:xfrm>
+                      <a:off x="0" y="0"/>
+                      <a:ext cx="5943600" cy="2837815"/>
+                    </a:xfrm>
+                    <a:prstGeom prst="rect">
+                      <a:avLst/>
+                    </a:prstGeom>
+                  </pic:spPr>
+                </pic:pic>
+              </a:graphicData>
+            </a:graphic>
+          </wp:inline>
+        </w:drawing>
+      </w:r>
+      <w:r>
+        <w:drawing>
+          <wp:inline distT="0" distB="0" distL="0" distR="0" wp14:anchorId="6249C62B" wp14:editId="67D65D85">
+            <wp:extent cx="5943600" cy="2976245"/>
+            <wp:effectExtent l="0" t="0" r="0" b="0"/>
+            <wp:docPr id="1544931519" name="Picture 1"/>
+            <wp:cNvGraphicFramePr>
+              <a:graphicFrameLocks xmlns:a="http://schemas.openxmlformats.org/drawingml/2006/main" noChangeAspect="1"/>
+            </wp:cNvGraphicFramePr>
+            <a:graphic xmlns:a="http://schemas.openxmlformats.org/drawingml/2006/main">
+              <a:graphicData uri="http://schemas.openxmlformats.org/drawingml/2006/picture">
+                <pic:pic xmlns:pic="http://schemas.openxmlformats.org/drawingml/2006/picture">
+                  <pic:nvPicPr>
+                    <pic:cNvPr id="1544931519" name=""/>
+                    <pic:cNvPicPr/>
+                  </pic:nvPicPr>
+                  <pic:blipFill>
+                    <a:blip r:embed="rId15"/>
+                    <a:stretch>
+                      <a:fillRect/>
+                    </a:stretch>
+                  </pic:blipFill>
+                  <pic:spPr>
+                    <a:xfrm>
+                      <a:off x="0" y="0"/>
+                      <a:ext cx="5943600" cy="2976245"/>
+                    </a:xfrm>
+                    <a:prstGeom prst="rect">
+                      <a:avLst/>
+                    </a:prstGeom>
+                  </pic:spPr>
+                </pic:pic>
+              </a:graphicData>
+            </a:graphic>
+          </wp:inline>
+        </w:drawing>
+      </w:r>
+    </w:p>
+    <w:p>
+      <w:r>
+        <w:lastRenderedPageBreak/>
+        <w:drawing>
+          <wp:inline distT="0" distB="0" distL="0" distR="0" wp14:anchorId="18A7379E" wp14:editId="155606A4">
+            <wp:extent cx="5943600" cy="2319020"/>
+            <wp:effectExtent l="0" t="0" r="0" b="5080"/>
+            <wp:docPr id="960356228" name="Picture 1"/>
+            <wp:cNvGraphicFramePr>
+              <a:graphicFrameLocks xmlns:a="http://schemas.openxmlformats.org/drawingml/2006/main" noChangeAspect="1"/>
+            </wp:cNvGraphicFramePr>
+            <a:graphic xmlns:a="http://schemas.openxmlformats.org/drawingml/2006/main">
+              <a:graphicData uri="http://schemas.openxmlformats.org/drawingml/2006/picture">
+                <pic:pic xmlns:pic="http://schemas.openxmlformats.org/drawingml/2006/picture">
+                  <pic:nvPicPr>
+                    <pic:cNvPr id="960356228" name=""/>
+                    <pic:cNvPicPr/>
+                  </pic:nvPicPr>
+                  <pic:blipFill>
+                    <a:blip r:embed="rId16"/>
+                    <a:stretch>
+                      <a:fillRect/>
+                    </a:stretch>
+                  </pic:blipFill>
+                  <pic:spPr>
+                    <a:xfrm>
+                      <a:off x="0" y="0"/>
+                      <a:ext cx="5943600" cy="2319020"/>
+                    </a:xfrm>
+                    <a:prstGeom prst="rect">
+                      <a:avLst/>
+                    </a:prstGeom>
+                  </pic:spPr>
+                </pic:pic>
+              </a:graphicData>
+            </a:graphic>
+          </wp:inline>
+        </w:drawing>
+      </w:r>
+    </w:p>
+    <w:p>
+      <w:r>
+        <w:drawing>
+          <wp:inline distT="0" distB="0" distL="0" distR="0" wp14:anchorId="1B04E769" wp14:editId="382E9243">
+            <wp:extent cx="5943600" cy="5212080"/>
+            <wp:effectExtent l="0" t="0" r="0" b="7620"/>
+            <wp:docPr id="310430001" name="Picture 1"/>
+            <wp:cNvGraphicFramePr>
+              <a:graphicFrameLocks xmlns:a="http://schemas.openxmlformats.org/drawingml/2006/main" noChangeAspect="1"/>
+            </wp:cNvGraphicFramePr>
+            <a:graphic xmlns:a="http://schemas.openxmlformats.org/drawingml/2006/main">
+              <a:graphicData uri="http://schemas.openxmlformats.org/drawingml/2006/picture">
+                <pic:pic xmlns:pic="http://schemas.openxmlformats.org/drawingml/2006/picture">
+                  <pic:nvPicPr>
+                    <pic:cNvPr id="310430001" name=""/>
+                    <pic:cNvPicPr/>
+                  </pic:nvPicPr>
+                  <pic:blipFill>
+                    <a:blip r:embed="rId17"/>
+                    <a:stretch>
+                      <a:fillRect/>
+                    </a:stretch>
+                  </pic:blipFill>
+                  <pic:spPr>
+                    <a:xfrm>
+                      <a:off x="0" y="0"/>
+                      <a:ext cx="5943600" cy="5212080"/>
                     </a:xfrm>
                     <a:prstGeom prst="rect">
                       <a:avLst/>
@@ -1191,6 +1463,7 @@
   <w:style w:type="character" w:default="1" w:styleId="DefaultParagraphFont">
     <w:name w:val="Default Paragraph Font"/>
     <w:uiPriority w:val="1"/>
+    <w:semiHidden/>
     <w:unhideWhenUsed/>
   </w:style>
   <w:style w:type="table" w:default="1" w:styleId="TableNormal">

</xml_diff>